<commit_message>
MAJ v5.1 : référence gabarits vs LLM ancré, résumé avec moteur et modèle, documentation
- évaluation : commentaires en mode gabarits et LLM ancré comparés aux commentaires publiés
  (ROUGE-L, similarité, couverture, Wilcoxon) ; côté gabarits mesuré, côté LLM non mesuré ici
- grille BN : notes stratégiques des deux versions ; figure gabarits vs LLM
- resume.md et manifest : moteur et modèle explicites ; Tableau 3.2 : 4 candidats Ollama + Groq
- docs : nouveau titre, double moteur, installation Groq (développement), écarts E11-E14, valeurs mises à jour
- test : le moteur livré est local

Co-Authored-By: Claude Opus 5.5 <noreply@anthropic.com>
Claude-Session: https://claude.ai/code/session_013JXMEQCNGgRjDzvz3X6fC9
</commit_message>
<xml_diff>
--- a/data/outputs/note_strategique_2024.docx
+++ b/data/outputs/note_strategique_2024.docx
@@ -289,7 +289,7 @@
         <w:pStyle w:val="ListBullet"/>
       </w:pPr>
       <w:r>
-        <w:t>Commentaire n° 74 (pme-typologie) — non validé</w:t>
+        <w:t>Commentaire n° 786 (pme-typologie) — non validé</w:t>
       </w:r>
     </w:p>
     <w:p>
@@ -297,7 +297,7 @@
         <w:pStyle w:val="ListBullet"/>
       </w:pPr>
       <w:r>
-        <w:t>Commentaire n° 75 (pme-secteur-activite) — non validé</w:t>
+        <w:t>Commentaire n° 787 (pme-secteur-activite) — non validé</w:t>
       </w:r>
     </w:p>
     <w:p>
@@ -305,7 +305,7 @@
         <w:pStyle w:val="ListBullet"/>
       </w:pPr>
       <w:r>
-        <w:t>Commentaire n° 64 (stock-pme-secteur-activite) — non validé</w:t>
+        <w:t>Commentaire n° 776 (stock-pme-secteur-activite) — non validé</w:t>
       </w:r>
     </w:p>
     <w:p>
@@ -313,7 +313,7 @@
         <w:pStyle w:val="ListBullet"/>
       </w:pPr>
       <w:r>
-        <w:t>Commentaire n° 66 (pme-creees-sur-periode) — non validé</w:t>
+        <w:t>Commentaire n° 778 (pme-creees-sur-periode) — non validé</w:t>
       </w:r>
     </w:p>
     <w:p>
@@ -321,7 +321,7 @@
         <w:pStyle w:val="ListBullet"/>
       </w:pPr>
       <w:r>
-        <w:t>Commentaire n° 71 (upa-enregistrees-dans-bureaux-communaux-region) — non validé</w:t>
+        <w:t>Commentaire n° 783 (upa-enregistrees-dans-bureaux-communaux-region) — non validé</w:t>
       </w:r>
     </w:p>
     <w:p>
@@ -329,7 +329,7 @@
         <w:pStyle w:val="ListBullet"/>
       </w:pPr>
       <w:r>
-        <w:t>Commentaire n° 73 (upa-enregistrees-typologie-artisanat-region) — non validé</w:t>
+        <w:t>Commentaire n° 785 (upa-enregistrees-typologie-artisanat-region) — non validé</w:t>
       </w:r>
     </w:p>
     <w:p>

</xml_diff>